<commit_message>
2025-04-13 Help Doc Update
</commit_message>
<xml_diff>
--- a/doc/2025-04-11-HOWTO_SecureCh11at.docx
+++ b/doc/2025-04-11-HOWTO_SecureCh11at.docx
@@ -1349,35 +1349,18 @@
         </w:rPr>
         <w:t xml:space="preserve"> </w:t>
       </w:r>
-      <w:hyperlink r:id="rId8" w:history="1">
-        <w:r>
-          <w:rPr>
-            <w:rFonts w:ascii="Trebuchet MS" w:hAnsi="Trebuchet MS" w:cs="Arial"/>
-            <w:i/>
-            <w:iCs/>
-            <w:lang w:val="en-US"/>
-          </w:rPr>
-          <w:t>test</w:t>
-        </w:r>
-        <w:r>
-          <w:rPr>
-            <w:rFonts w:ascii="Trebuchet MS" w:hAnsi="Trebuchet MS" w:cs="Arial"/>
-            <w:i/>
-            <w:iCs/>
-            <w:lang w:val="en-US"/>
-          </w:rPr>
-          <w:t xml:space="preserve"> </w:t>
-        </w:r>
-        <w:r>
-          <w:rPr>
-            <w:rFonts w:ascii="Trebuchet MS" w:hAnsi="Trebuchet MS" w:cs="Arial"/>
-            <w:i/>
-            <w:iCs/>
-            <w:lang w:val="en-US"/>
-          </w:rPr>
-          <w:t>form</w:t>
-        </w:r>
-      </w:hyperlink>
+      <w:r>
+        <w:fldChar w:fldCharType="begin"/>
+      </w:r>
+      <w:r>
+        <w:rPr>
+          <w:lang w:val="en-US"/>
+        </w:rPr>
+        <w:instrText>HYPERLINK "https://area23.at/net/Crypt/CoolCrypt.aspx"</w:instrText>
+      </w:r>
+      <w:r>
+        <w:fldChar w:fldCharType="separate"/>
+      </w:r>
       <w:r>
         <w:rPr>
           <w:rFonts w:ascii="Trebuchet MS" w:hAnsi="Trebuchet MS" w:cs="Arial"/>
@@ -1385,17 +1368,47 @@
           <w:iCs/>
           <w:lang w:val="en-US"/>
         </w:rPr>
-        <w:t>.</w:t>
-      </w:r>
-    </w:p>
-    <w:p>
-      <w:pPr>
+        <w:t>test</w:t>
+      </w:r>
+      <w:r>
         <w:rPr>
           <w:rFonts w:ascii="Trebuchet MS" w:hAnsi="Trebuchet MS" w:cs="Arial"/>
           <w:i/>
           <w:iCs/>
           <w:lang w:val="en-US"/>
         </w:rPr>
+        <w:t xml:space="preserve"> </w:t>
+      </w:r>
+      <w:r>
+        <w:rPr>
+          <w:rFonts w:ascii="Trebuchet MS" w:hAnsi="Trebuchet MS" w:cs="Arial"/>
+          <w:i/>
+          <w:iCs/>
+          <w:lang w:val="en-US"/>
+        </w:rPr>
+        <w:t>form</w:t>
+      </w:r>
+      <w:r>
+        <w:fldChar w:fldCharType="end"/>
+      </w:r>
+      <w:r>
+        <w:rPr>
+          <w:rFonts w:ascii="Trebuchet MS" w:hAnsi="Trebuchet MS" w:cs="Arial"/>
+          <w:i/>
+          <w:iCs/>
+          <w:lang w:val="en-US"/>
+        </w:rPr>
+        <w:t>.</w:t>
+      </w:r>
+    </w:p>
+    <w:p>
+      <w:pPr>
+        <w:rPr>
+          <w:rFonts w:ascii="Trebuchet MS" w:hAnsi="Trebuchet MS" w:cs="Arial"/>
+          <w:i/>
+          <w:iCs/>
+          <w:lang w:val="en-US"/>
+        </w:rPr>
       </w:pPr>
     </w:p>
     <w:p>
@@ -1499,34 +1512,29 @@
         </w:rPr>
         <w:fldChar w:fldCharType="end"/>
       </w:r>
-      <w:hyperlink r:id="rId9" w:history="1">
-        <w:r>
-          <w:rPr>
-            <w:rStyle w:val="Hyperlink"/>
-            <w:rFonts w:ascii="Lucida Sans Unicode" w:hAnsi="Lucida Sans Unicode" w:cs="Lucida Sans Unicode"/>
-            <w:lang w:val="en-US"/>
-          </w:rPr>
-          <w:t>https://github.com/dotnet/</w:t>
-        </w:r>
-      </w:hyperlink>
-    </w:p>
-    <w:p>
-      <w:pPr>
-        <w:rPr>
+      <w:r>
+        <w:fldChar w:fldCharType="begin"/>
+      </w:r>
+      <w:r>
+        <w:rPr>
+          <w:lang w:val="en-US"/>
+        </w:rPr>
+        <w:instrText>HYPERLINK "https://github.com/dotnet/"</w:instrText>
+      </w:r>
+      <w:r>
+        <w:fldChar w:fldCharType="separate"/>
+      </w:r>
+      <w:r>
+        <w:rPr>
+          <w:rStyle w:val="Hyperlink"/>
           <w:rFonts w:ascii="Lucida Sans Unicode" w:hAnsi="Lucida Sans Unicode" w:cs="Lucida Sans Unicode"/>
           <w:lang w:val="en-US"/>
         </w:rPr>
-      </w:pPr>
-      <w:hyperlink r:id="rId10" w:history="1">
-        <w:r>
-          <w:rPr>
-            <w:rStyle w:val="Hyperlink"/>
-            <w:rFonts w:ascii="Lucida Sans Unicode" w:hAnsi="Lucida Sans Unicode" w:cs="Lucida Sans Unicode"/>
-            <w:lang w:val="en-US"/>
-          </w:rPr>
-          <w:t>https://github.com/microsoft</w:t>
-        </w:r>
-      </w:hyperlink>
+        <w:t>https://github.com/dotnet/</w:t>
+      </w:r>
+      <w:r>
+        <w:fldChar w:fldCharType="end"/>
+      </w:r>
     </w:p>
     <w:p>
       <w:pPr>
@@ -1535,7 +1543,38 @@
           <w:lang w:val="en-US"/>
         </w:rPr>
       </w:pPr>
-      <w:hyperlink r:id="rId11" w:history="1">
+      <w:r>
+        <w:fldChar w:fldCharType="begin"/>
+      </w:r>
+      <w:r>
+        <w:rPr>
+          <w:lang w:val="en-US"/>
+        </w:rPr>
+        <w:instrText>HYPERLINK "https://github.com/microsoft"</w:instrText>
+      </w:r>
+      <w:r>
+        <w:fldChar w:fldCharType="separate"/>
+      </w:r>
+      <w:r>
+        <w:rPr>
+          <w:rStyle w:val="Hyperlink"/>
+          <w:rFonts w:ascii="Lucida Sans Unicode" w:hAnsi="Lucida Sans Unicode" w:cs="Lucida Sans Unicode"/>
+          <w:lang w:val="en-US"/>
+        </w:rPr>
+        <w:t>https://github.com/microsoft</w:t>
+      </w:r>
+      <w:r>
+        <w:fldChar w:fldCharType="end"/>
+      </w:r>
+    </w:p>
+    <w:p>
+      <w:pPr>
+        <w:rPr>
+          <w:rFonts w:ascii="Lucida Sans Unicode" w:hAnsi="Lucida Sans Unicode" w:cs="Lucida Sans Unicode"/>
+          <w:lang w:val="en-US"/>
+        </w:rPr>
+      </w:pPr>
+      <w:hyperlink r:id="rId8" w:history="1">
         <w:r>
           <w:rPr>
             <w:rStyle w:val="Hyperlink"/>
@@ -1665,16 +1704,29 @@
           <w:lang w:val="en-US"/>
         </w:rPr>
       </w:pPr>
-      <w:hyperlink r:id="rId12" w:history="1">
-        <w:r>
-          <w:rPr>
-            <w:rStyle w:val="Hyperlink"/>
-            <w:rFonts w:ascii="Lucida Sans Unicode" w:hAnsi="Lucida Sans Unicode" w:cs="Lucida Sans Unicode"/>
-            <w:lang w:val="en-US"/>
-          </w:rPr>
-          <w:t>https://github.com/heinrichelsigan/chat-ipv6</w:t>
-        </w:r>
-      </w:hyperlink>
+      <w:r>
+        <w:fldChar w:fldCharType="begin"/>
+      </w:r>
+      <w:r>
+        <w:rPr>
+          <w:lang w:val="en-US"/>
+        </w:rPr>
+        <w:instrText>HYPERLINK "https://github.com/heinrichelsigan/chat-ipv6"</w:instrText>
+      </w:r>
+      <w:r>
+        <w:fldChar w:fldCharType="separate"/>
+      </w:r>
+      <w:r>
+        <w:rPr>
+          <w:rStyle w:val="Hyperlink"/>
+          <w:rFonts w:ascii="Lucida Sans Unicode" w:hAnsi="Lucida Sans Unicode" w:cs="Lucida Sans Unicode"/>
+          <w:lang w:val="en-US"/>
+        </w:rPr>
+        <w:t>https://github.com/heinrichelsigan/chat-ipv6</w:t>
+      </w:r>
+      <w:r>
+        <w:fldChar w:fldCharType="end"/>
+      </w:r>
     </w:p>
     <w:p>
       <w:pPr>
@@ -1761,17 +1813,30 @@
         </w:rPr>
         <w:t xml:space="preserve">o to </w:t>
       </w:r>
-      <w:hyperlink r:id="rId13" w:history="1">
-        <w:r>
-          <w:rPr>
-            <w:rStyle w:val="Hyperlink"/>
-            <w:color w:val="1F3763" w:themeColor="accent1" w:themeShade="7F"/>
-            <w:u w:val="none"/>
-            <w:lang w:val="en-US"/>
-          </w:rPr>
-          <w:t>https://cqrxs.eu/download/</w:t>
-        </w:r>
-      </w:hyperlink>
+      <w:r>
+        <w:fldChar w:fldCharType="begin"/>
+      </w:r>
+      <w:r>
+        <w:rPr>
+          <w:lang w:val="en-US"/>
+        </w:rPr>
+        <w:instrText>HYPERLINK "https://cqrxs.eu/download/"</w:instrText>
+      </w:r>
+      <w:r>
+        <w:fldChar w:fldCharType="separate"/>
+      </w:r>
+      <w:r>
+        <w:rPr>
+          <w:rStyle w:val="Hyperlink"/>
+          <w:color w:val="1F3763" w:themeColor="accent1" w:themeShade="7F"/>
+          <w:u w:val="none"/>
+          <w:lang w:val="en-US"/>
+        </w:rPr>
+        <w:t>https://cqrxs.eu/download/</w:t>
+      </w:r>
+      <w:r>
+        <w:fldChar w:fldCharType="end"/>
+      </w:r>
       <w:r>
         <w:rPr>
           <w:rStyle w:val="berschrift1Zchn"/>
@@ -1965,7 +2030,7 @@
                     <pic:cNvPicPr/>
                   </pic:nvPicPr>
                   <pic:blipFill>
-                    <a:blip r:embed="rId14"/>
+                    <a:blip r:embed="rId9"/>
                     <a:stretch>
                       <a:fillRect/>
                     </a:stretch>
@@ -2158,7 +2223,7 @@
                     <pic:cNvPicPr/>
                   </pic:nvPicPr>
                   <pic:blipFill>
-                    <a:blip r:embed="rId15"/>
+                    <a:blip r:embed="rId10"/>
                     <a:stretch>
                       <a:fillRect/>
                     </a:stretch>
@@ -2218,7 +2283,7 @@
                     <pic:cNvPicPr/>
                   </pic:nvPicPr>
                   <pic:blipFill>
-                    <a:blip r:embed="rId16"/>
+                    <a:blip r:embed="rId11"/>
                     <a:stretch>
                       <a:fillRect/>
                     </a:stretch>
@@ -2328,7 +2393,7 @@
                     <pic:cNvPicPr/>
                   </pic:nvPicPr>
                   <pic:blipFill>
-                    <a:blip r:embed="rId17"/>
+                    <a:blip r:embed="rId12"/>
                     <a:stretch>
                       <a:fillRect/>
                     </a:stretch>
@@ -2416,6 +2481,7 @@
       </w:pPr>
       <w:r>
         <w:rPr>
+          <w:noProof/>
           <w:lang w:val="en-US"/>
         </w:rPr>
         <w:drawing>
@@ -2434,7 +2500,7 @@
                     <pic:cNvPicPr/>
                   </pic:nvPicPr>
                   <pic:blipFill>
-                    <a:blip r:embed="rId18"/>
+                    <a:blip r:embed="rId13"/>
                     <a:stretch>
                       <a:fillRect/>
                     </a:stretch>
@@ -2604,6 +2670,7 @@
       </w:pPr>
       <w:r>
         <w:rPr>
+          <w:noProof/>
           <w:lang w:val="en-US"/>
         </w:rPr>
         <w:drawing>
@@ -2622,7 +2689,7 @@
                     <pic:cNvPicPr/>
                   </pic:nvPicPr>
                   <pic:blipFill>
-                    <a:blip r:embed="rId19"/>
+                    <a:blip r:embed="rId14"/>
                     <a:stretch>
                       <a:fillRect/>
                     </a:stretch>
@@ -2695,6 +2762,7 @@
       </w:pPr>
       <w:r>
         <w:rPr>
+          <w:noProof/>
           <w:lang w:val="en-US"/>
         </w:rPr>
         <w:drawing>
@@ -2713,7 +2781,7 @@
                     <pic:cNvPicPr/>
                   </pic:nvPicPr>
                   <pic:blipFill>
-                    <a:blip r:embed="rId20"/>
+                    <a:blip r:embed="rId15"/>
                     <a:stretch>
                       <a:fillRect/>
                     </a:stretch>
@@ -2913,7 +2981,7 @@
                     <pic:cNvPicPr/>
                   </pic:nvPicPr>
                   <pic:blipFill>
-                    <a:blip r:embed="rId21"/>
+                    <a:blip r:embed="rId16"/>
                     <a:stretch>
                       <a:fillRect/>
                     </a:stretch>
@@ -2961,7 +3029,7 @@
                     <pic:cNvPicPr/>
                   </pic:nvPicPr>
                   <pic:blipFill>
-                    <a:blip r:embed="rId22"/>
+                    <a:blip r:embed="rId17"/>
                     <a:stretch>
                       <a:fillRect/>
                     </a:stretch>
@@ -3044,7 +3112,7 @@
                     <pic:cNvPicPr/>
                   </pic:nvPicPr>
                   <pic:blipFill>
-                    <a:blip r:embed="rId23"/>
+                    <a:blip r:embed="rId18"/>
                     <a:stretch>
                       <a:fillRect/>
                     </a:stretch>
@@ -3133,7 +3201,7 @@
                     <pic:cNvPicPr/>
                   </pic:nvPicPr>
                   <pic:blipFill>
-                    <a:blip r:embed="rId24"/>
+                    <a:blip r:embed="rId19"/>
                     <a:stretch>
                       <a:fillRect/>
                     </a:stretch>
@@ -3215,15 +3283,28 @@
         </w:rPr>
         <w:t xml:space="preserve">: </w:t>
       </w:r>
-      <w:hyperlink r:id="rId25" w:history="1">
-        <w:r>
-          <w:rPr>
-            <w:rStyle w:val="Hyperlink"/>
-            <w:lang w:val="en-US"/>
-          </w:rPr>
-          <w:t>https://cqrxs.eu/cqrsrv/cqrjd/CqrService.asmx</w:t>
-        </w:r>
-      </w:hyperlink>
+      <w:r>
+        <w:fldChar w:fldCharType="begin"/>
+      </w:r>
+      <w:r>
+        <w:rPr>
+          <w:lang w:val="en-US"/>
+        </w:rPr>
+        <w:instrText>HYPERLINK "https://cqrxs.eu/cqrsrv/cqrjd/CqrService.asmx"</w:instrText>
+      </w:r>
+      <w:r>
+        <w:fldChar w:fldCharType="separate"/>
+      </w:r>
+      <w:r>
+        <w:rPr>
+          <w:rStyle w:val="Hyperlink"/>
+          <w:lang w:val="en-US"/>
+        </w:rPr>
+        <w:t>https://cqrxs.eu/cqrsrv/cqrjd/CqrService.asmx</w:t>
+      </w:r>
+      <w:r>
+        <w:fldChar w:fldCharType="end"/>
+      </w:r>
       <w:r>
         <w:rPr>
           <w:lang w:val="en-US"/>
@@ -3242,15 +3323,28 @@
         </w:rPr>
         <w:t xml:space="preserve">, you must import contacts first, see </w:t>
       </w:r>
-      <w:hyperlink w:anchor="_Import_Contacts_from" w:history="1">
-        <w:r>
-          <w:rPr>
-            <w:rStyle w:val="Hyperlink"/>
-            <w:lang w:val="en-US"/>
-          </w:rPr>
-          <w:t>section import contacts</w:t>
-        </w:r>
-      </w:hyperlink>
+      <w:r>
+        <w:fldChar w:fldCharType="begin"/>
+      </w:r>
+      <w:r>
+        <w:rPr>
+          <w:lang w:val="en-US"/>
+        </w:rPr>
+        <w:instrText>HYPERLINK \l "_Import_Contacts_from"</w:instrText>
+      </w:r>
+      <w:r>
+        <w:fldChar w:fldCharType="separate"/>
+      </w:r>
+      <w:r>
+        <w:rPr>
+          <w:rStyle w:val="Hyperlink"/>
+          <w:lang w:val="en-US"/>
+        </w:rPr>
+        <w:t>section import contacts</w:t>
+      </w:r>
+      <w:r>
+        <w:fldChar w:fldCharType="end"/>
+      </w:r>
       <w:r>
         <w:rPr>
           <w:lang w:val="en-US"/>
@@ -3286,7 +3380,7 @@
                     </pic:cNvPicPr>
                   </pic:nvPicPr>
                   <pic:blipFill>
-                    <a:blip r:embed="rId26">
+                    <a:blip r:embed="rId20">
                       <a:extLst>
                         <a:ext uri="{28A0092B-C50C-407E-A947-70E740481C1C}">
                           <a14:useLocalDpi xmlns:a14="http://schemas.microsoft.com/office/drawing/2010/main" val="0"/>
@@ -3480,7 +3574,7 @@
                     <pic:cNvPicPr/>
                   </pic:nvPicPr>
                   <pic:blipFill>
-                    <a:blip r:embed="rId27"/>
+                    <a:blip r:embed="rId21"/>
                     <a:stretch>
                       <a:fillRect/>
                     </a:stretch>
@@ -3623,7 +3717,7 @@
                     <pic:cNvPicPr/>
                   </pic:nvPicPr>
                   <pic:blipFill>
-                    <a:blip r:embed="rId28"/>
+                    <a:blip r:embed="rId22"/>
                     <a:stretch>
                       <a:fillRect/>
                     </a:stretch>
@@ -3696,7 +3790,7 @@
                     <pic:cNvPicPr/>
                   </pic:nvPicPr>
                   <pic:blipFill>
-                    <a:blip r:embed="rId29"/>
+                    <a:blip r:embed="rId23"/>
                     <a:stretch>
                       <a:fillRect/>
                     </a:stretch>
@@ -3765,31 +3859,44 @@
         <w:br/>
         <w:t xml:space="preserve">After pressing the invite button, </w:t>
       </w:r>
-      <w:hyperlink r:id="rId30" w:history="1">
-        <w:r>
-          <w:rPr>
-            <w:rStyle w:val="Hyperlink"/>
-            <w:lang w:val="en-US"/>
-          </w:rPr>
-          <w:t xml:space="preserve">a new chat room invite request with your and invited person contact data will be send to AWS WS in </w:t>
-        </w:r>
-        <w:proofErr w:type="spellStart"/>
-        <w:r>
-          <w:rPr>
-            <w:rStyle w:val="Hyperlink"/>
-            <w:lang w:val="en-US"/>
-          </w:rPr>
-          <w:t>spain</w:t>
-        </w:r>
-        <w:proofErr w:type="spellEnd"/>
-        <w:r>
-          <w:rPr>
-            <w:rStyle w:val="Hyperlink"/>
-            <w:lang w:val="en-US"/>
-          </w:rPr>
-          <w:t>.</w:t>
-        </w:r>
-      </w:hyperlink>
+      <w:r>
+        <w:fldChar w:fldCharType="begin"/>
+      </w:r>
+      <w:r>
+        <w:rPr>
+          <w:lang w:val="en-US"/>
+        </w:rPr>
+        <w:instrText>HYPERLINK "https://cqrxs.eu/cqrsrv/cqrjd/CqrService.asmx"</w:instrText>
+      </w:r>
+      <w:r>
+        <w:fldChar w:fldCharType="separate"/>
+      </w:r>
+      <w:r>
+        <w:rPr>
+          <w:rStyle w:val="Hyperlink"/>
+          <w:lang w:val="en-US"/>
+        </w:rPr>
+        <w:t xml:space="preserve">a new chat room invite request with your and invited person contact data will be send to AWS WS in </w:t>
+      </w:r>
+      <w:proofErr w:type="spellStart"/>
+      <w:r>
+        <w:rPr>
+          <w:rStyle w:val="Hyperlink"/>
+          <w:lang w:val="en-US"/>
+        </w:rPr>
+        <w:t>spain</w:t>
+      </w:r>
+      <w:proofErr w:type="spellEnd"/>
+      <w:r>
+        <w:rPr>
+          <w:rStyle w:val="Hyperlink"/>
+          <w:lang w:val="en-US"/>
+        </w:rPr>
+        <w:t>.</w:t>
+      </w:r>
+      <w:r>
+        <w:fldChar w:fldCharType="end"/>
+      </w:r>
     </w:p>
     <w:p>
       <w:pPr>
@@ -3915,7 +4022,7 @@
                     </pic:cNvPicPr>
                   </pic:nvPicPr>
                   <pic:blipFill>
-                    <a:blip r:embed="rId31">
+                    <a:blip r:embed="rId24">
                       <a:extLst>
                         <a:ext uri="{28A0092B-C50C-407E-A947-70E740481C1C}">
                           <a14:useLocalDpi xmlns:a14="http://schemas.microsoft.com/office/drawing/2010/main" val="0"/>
@@ -3976,7 +4083,7 @@
                     </pic:cNvPicPr>
                   </pic:nvPicPr>
                   <pic:blipFill>
-                    <a:blip r:embed="rId32">
+                    <a:blip r:embed="rId25">
                       <a:extLst>
                         <a:ext uri="{28A0092B-C50C-407E-A947-70E740481C1C}">
                           <a14:useLocalDpi xmlns:a14="http://schemas.microsoft.com/office/drawing/2010/main" val="0"/>
@@ -4573,7 +4680,7 @@
                     </pic:cNvPicPr>
                   </pic:nvPicPr>
                   <pic:blipFill>
-                    <a:blip r:embed="rId33">
+                    <a:blip r:embed="rId26">
                       <a:extLst>
                         <a:ext uri="{28A0092B-C50C-407E-A947-70E740481C1C}">
                           <a14:useLocalDpi xmlns:a14="http://schemas.microsoft.com/office/drawing/2010/main" val="0"/>
@@ -4701,7 +4808,7 @@
                     <pic:cNvPicPr/>
                   </pic:nvPicPr>
                   <pic:blipFill>
-                    <a:blip r:embed="rId34"/>
+                    <a:blip r:embed="rId27"/>
                     <a:stretch>
                       <a:fillRect/>
                     </a:stretch>
@@ -4781,7 +4888,7 @@
                     <pic:cNvPicPr/>
                   </pic:nvPicPr>
                   <pic:blipFill>
-                    <a:blip r:embed="rId35"/>
+                    <a:blip r:embed="rId28"/>
                     <a:stretch>
                       <a:fillRect/>
                     </a:stretch>
@@ -4868,15 +4975,28 @@
         </w:rPr>
         <w:t xml:space="preserve">on </w:t>
       </w:r>
-      <w:hyperlink r:id="rId36" w:history="1">
-        <w:r>
-          <w:rPr>
-            <w:rStyle w:val="Hyperlink"/>
-            <w:lang w:val="en-US"/>
-          </w:rPr>
-          <w:t>https://cqrxs.eu</w:t>
-        </w:r>
-      </w:hyperlink>
+      <w:r>
+        <w:fldChar w:fldCharType="begin"/>
+      </w:r>
+      <w:r>
+        <w:rPr>
+          <w:lang w:val="en-US"/>
+        </w:rPr>
+        <w:instrText>HYPERLINK "https://cqrxs.eu"</w:instrText>
+      </w:r>
+      <w:r>
+        <w:fldChar w:fldCharType="separate"/>
+      </w:r>
+      <w:r>
+        <w:rPr>
+          <w:rStyle w:val="Hyperlink"/>
+          <w:lang w:val="en-US"/>
+        </w:rPr>
+        <w:t>https://cqrxs.eu</w:t>
+      </w:r>
+      <w:r>
+        <w:fldChar w:fldCharType="end"/>
+      </w:r>
       <w:r>
         <w:rPr>
           <w:lang w:val="en-US"/>
@@ -4910,7 +5030,7 @@
                     <pic:cNvPicPr/>
                   </pic:nvPicPr>
                   <pic:blipFill>
-                    <a:blip r:embed="rId37"/>
+                    <a:blip r:embed="rId29"/>
                     <a:stretch>
                       <a:fillRect/>
                     </a:stretch>
@@ -4936,31 +5056,57 @@
         </w:rPr>
         <w:br/>
       </w:r>
-      <w:hyperlink r:id="rId38" w:history="1">
-        <w:r>
-          <w:rPr>
-            <w:rStyle w:val="Hyperlink"/>
-            <w:lang w:val="en-US"/>
-          </w:rPr>
-          <w:t>https://valkey.io/commands/randomkey/</w:t>
-        </w:r>
-      </w:hyperlink>
-    </w:p>
-    <w:p>
-      <w:pPr>
-        <w:rPr>
-          <w:lang w:val="en-US"/>
-        </w:rPr>
-      </w:pPr>
-      <w:hyperlink r:id="rId39" w:history="1">
-        <w:r>
-          <w:rPr>
-            <w:rStyle w:val="Hyperlink"/>
-            <w:lang w:val="en-US"/>
-          </w:rPr>
-          <w:t>https://cqrxs.eu/cqrsrv/cqrjd/CqrService.asmx</w:t>
-        </w:r>
-      </w:hyperlink>
+      <w:r>
+        <w:fldChar w:fldCharType="begin"/>
+      </w:r>
+      <w:r>
+        <w:rPr>
+          <w:lang w:val="en-US"/>
+        </w:rPr>
+        <w:instrText>HYPERLINK "https://valkey.io/commands/randomkey/"</w:instrText>
+      </w:r>
+      <w:r>
+        <w:fldChar w:fldCharType="separate"/>
+      </w:r>
+      <w:r>
+        <w:rPr>
+          <w:rStyle w:val="Hyperlink"/>
+          <w:lang w:val="en-US"/>
+        </w:rPr>
+        <w:t>https://valkey.io/commands/randomkey/</w:t>
+      </w:r>
+      <w:r>
+        <w:fldChar w:fldCharType="end"/>
+      </w:r>
+    </w:p>
+    <w:p>
+      <w:pPr>
+        <w:rPr>
+          <w:lang w:val="en-US"/>
+        </w:rPr>
+      </w:pPr>
+      <w:r>
+        <w:fldChar w:fldCharType="begin"/>
+      </w:r>
+      <w:r>
+        <w:rPr>
+          <w:lang w:val="en-US"/>
+        </w:rPr>
+        <w:instrText>HYPERLINK "https://cqrxs.eu/cqrsrv/cqrjd/CqrService.asmx"</w:instrText>
+      </w:r>
+      <w:r>
+        <w:fldChar w:fldCharType="separate"/>
+      </w:r>
+      <w:r>
+        <w:rPr>
+          <w:rStyle w:val="Hyperlink"/>
+          <w:lang w:val="en-US"/>
+        </w:rPr>
+        <w:t>https://cqrxs.eu/cqrsrv/cqrjd/CqrService.asmx</w:t>
+      </w:r>
+      <w:r>
+        <w:fldChar w:fldCharType="end"/>
+      </w:r>
       <w:r>
         <w:rPr>
           <w:lang w:val="en-US"/>
@@ -5023,15 +5169,28 @@
         </w:rPr>
         <w:t xml:space="preserve">Go to </w:t>
       </w:r>
-      <w:hyperlink r:id="rId40" w:history="1">
-        <w:r>
-          <w:rPr>
-            <w:rStyle w:val="Hyperlink"/>
-            <w:lang w:val="en-US"/>
-          </w:rPr>
-          <w:t>https://contacts.google.com/</w:t>
-        </w:r>
-      </w:hyperlink>
+      <w:r>
+        <w:fldChar w:fldCharType="begin"/>
+      </w:r>
+      <w:r>
+        <w:rPr>
+          <w:lang w:val="en-US"/>
+        </w:rPr>
+        <w:instrText>HYPERLINK "https://contacts.google.com/"</w:instrText>
+      </w:r>
+      <w:r>
+        <w:fldChar w:fldCharType="separate"/>
+      </w:r>
+      <w:r>
+        <w:rPr>
+          <w:rStyle w:val="Hyperlink"/>
+          <w:lang w:val="en-US"/>
+        </w:rPr>
+        <w:t>https://contacts.google.com/</w:t>
+      </w:r>
+      <w:r>
+        <w:fldChar w:fldCharType="end"/>
+      </w:r>
       <w:r>
         <w:rPr>
           <w:lang w:val="en-US"/>
@@ -5071,7 +5230,7 @@
                     <pic:cNvPicPr/>
                   </pic:nvPicPr>
                   <pic:blipFill>
-                    <a:blip r:embed="rId41"/>
+                    <a:blip r:embed="rId30"/>
                     <a:stretch>
                       <a:fillRect/>
                     </a:stretch>
@@ -5132,7 +5291,7 @@
                     <pic:cNvPicPr/>
                   </pic:nvPicPr>
                   <pic:blipFill>
-                    <a:blip r:embed="rId42"/>
+                    <a:blip r:embed="rId31"/>
                     <a:stretch>
                       <a:fillRect/>
                     </a:stretch>
@@ -5193,7 +5352,7 @@
                     <pic:cNvPicPr/>
                   </pic:nvPicPr>
                   <pic:blipFill>
-                    <a:blip r:embed="rId43"/>
+                    <a:blip r:embed="rId32"/>
                     <a:stretch>
                       <a:fillRect/>
                     </a:stretch>
@@ -5241,7 +5400,7 @@
                     <pic:cNvPicPr/>
                   </pic:nvPicPr>
                   <pic:blipFill>
-                    <a:blip r:embed="rId44"/>
+                    <a:blip r:embed="rId33"/>
                     <a:stretch>
                       <a:fillRect/>
                     </a:stretch>
@@ -5288,7 +5447,7 @@
                     <pic:cNvPicPr/>
                   </pic:nvPicPr>
                   <pic:blipFill>
-                    <a:blip r:embed="rId45"/>
+                    <a:blip r:embed="rId34"/>
                     <a:stretch>
                       <a:fillRect/>
                     </a:stretch>
@@ -5511,7 +5670,7 @@
                     <pic:cNvPicPr/>
                   </pic:nvPicPr>
                   <pic:blipFill>
-                    <a:blip r:embed="rId46"/>
+                    <a:blip r:embed="rId35"/>
                     <a:stretch>
                       <a:fillRect/>
                     </a:stretch>
@@ -5605,7 +5764,7 @@
                     <pic:cNvPicPr/>
                   </pic:nvPicPr>
                   <pic:blipFill>
-                    <a:blip r:embed="rId47"/>
+                    <a:blip r:embed="rId36"/>
                     <a:stretch>
                       <a:fillRect/>
                     </a:stretch>
@@ -5648,7 +5807,7 @@
                     <pic:cNvPicPr/>
                   </pic:nvPicPr>
                   <pic:blipFill>
-                    <a:blip r:embed="rId48"/>
+                    <a:blip r:embed="rId37"/>
                     <a:stretch>
                       <a:fillRect/>
                     </a:stretch>
@@ -5721,7 +5880,7 @@
                     <pic:cNvPicPr/>
                   </pic:nvPicPr>
                   <pic:blipFill>
-                    <a:blip r:embed="rId49"/>
+                    <a:blip r:embed="rId38"/>
                     <a:stretch>
                       <a:fillRect/>
                     </a:stretch>
@@ -5857,7 +6016,7 @@
                     <pic:cNvPicPr/>
                   </pic:nvPicPr>
                   <pic:blipFill>
-                    <a:blip r:embed="rId50"/>
+                    <a:blip r:embed="rId39"/>
                     <a:stretch>
                       <a:fillRect/>
                     </a:stretch>
@@ -5910,7 +6069,7 @@
                     <pic:cNvPicPr/>
                   </pic:nvPicPr>
                   <pic:blipFill>
-                    <a:blip r:embed="rId51"/>
+                    <a:blip r:embed="rId40"/>
                     <a:stretch>
                       <a:fillRect/>
                     </a:stretch>
@@ -5958,7 +6117,7 @@
                     <pic:cNvPicPr/>
                   </pic:nvPicPr>
                   <pic:blipFill>
-                    <a:blip r:embed="rId52"/>
+                    <a:blip r:embed="rId41"/>
                     <a:stretch>
                       <a:fillRect/>
                     </a:stretch>
@@ -6111,7 +6270,7 @@
                     <pic:cNvPicPr/>
                   </pic:nvPicPr>
                   <pic:blipFill>
-                    <a:blip r:embed="rId53"/>
+                    <a:blip r:embed="rId42"/>
                     <a:stretch>
                       <a:fillRect/>
                     </a:stretch>
@@ -6283,7 +6442,7 @@
                     </pic:cNvPicPr>
                   </pic:nvPicPr>
                   <pic:blipFill>
-                    <a:blip r:embed="rId54">
+                    <a:blip r:embed="rId43">
                       <a:extLst>
                         <a:ext uri="{28A0092B-C50C-407E-A947-70E740481C1C}">
                           <a14:useLocalDpi xmlns:a14="http://schemas.microsoft.com/office/drawing/2010/main" val="0"/>
@@ -6377,7 +6536,7 @@
                     <pic:cNvPicPr/>
                   </pic:nvPicPr>
                   <pic:blipFill>
-                    <a:blip r:embed="rId55"/>
+                    <a:blip r:embed="rId44"/>
                     <a:stretch>
                       <a:fillRect/>
                     </a:stretch>
@@ -6456,7 +6615,7 @@
                     <pic:cNvPicPr/>
                   </pic:nvPicPr>
                   <pic:blipFill>
-                    <a:blip r:embed="rId56"/>
+                    <a:blip r:embed="rId45"/>
                     <a:stretch>
                       <a:fillRect/>
                     </a:stretch>
@@ -6602,7 +6761,7 @@
                     <pic:cNvPicPr/>
                   </pic:nvPicPr>
                   <pic:blipFill>
-                    <a:blip r:embed="rId57"/>
+                    <a:blip r:embed="rId46"/>
                     <a:stretch>
                       <a:fillRect/>
                     </a:stretch>
@@ -6692,7 +6851,7 @@
                     <pic:cNvPicPr/>
                   </pic:nvPicPr>
                   <pic:blipFill>
-                    <a:blip r:embed="rId58"/>
+                    <a:blip r:embed="rId47"/>
                     <a:stretch>
                       <a:fillRect/>
                     </a:stretch>
@@ -6769,24 +6928,37 @@
         </w:rPr>
         <w:tab/>
       </w:r>
-      <w:hyperlink r:id="rId59" w:history="1">
-        <w:proofErr w:type="spellStart"/>
-        <w:r>
-          <w:rPr>
-            <w:rStyle w:val="Hyperlink"/>
-            <w:lang w:val="en-US"/>
-          </w:rPr>
-          <w:t>AES</w:t>
-        </w:r>
-        <w:proofErr w:type="spellEnd"/>
-        <w:r>
-          <w:rPr>
-            <w:rStyle w:val="Hyperlink"/>
-            <w:lang w:val="en-US"/>
-          </w:rPr>
-          <w:t xml:space="preserve"> Galois field</w:t>
-        </w:r>
-      </w:hyperlink>
+      <w:r>
+        <w:fldChar w:fldCharType="begin"/>
+      </w:r>
+      <w:r>
+        <w:rPr>
+          <w:lang w:val="en-US"/>
+        </w:rPr>
+        <w:instrText>HYPERLINK "https://en.wikipedia.org/wiki/Rijndael_MixColumns"</w:instrText>
+      </w:r>
+      <w:r>
+        <w:fldChar w:fldCharType="separate"/>
+      </w:r>
+      <w:proofErr w:type="spellStart"/>
+      <w:r>
+        <w:rPr>
+          <w:rStyle w:val="Hyperlink"/>
+          <w:lang w:val="en-US"/>
+        </w:rPr>
+        <w:t>AES</w:t>
+      </w:r>
+      <w:proofErr w:type="spellEnd"/>
+      <w:r>
+        <w:rPr>
+          <w:rStyle w:val="Hyperlink"/>
+          <w:lang w:val="en-US"/>
+        </w:rPr>
+        <w:t xml:space="preserve"> Galois field</w:t>
+      </w:r>
+      <w:r>
+        <w:fldChar w:fldCharType="end"/>
+      </w:r>
       <w:r>
         <w:rPr>
           <w:lang w:val="en-US"/>
@@ -6838,17 +7010,30 @@
         </w:rPr>
         <w:t xml:space="preserve"> on </w:t>
       </w:r>
-      <w:hyperlink r:id="rId60" w:history="1">
-        <w:proofErr w:type="spellStart"/>
-        <w:r>
-          <w:rPr>
-            <w:rStyle w:val="Hyperlink"/>
-            <w:lang w:val="en-US"/>
-          </w:rPr>
-          <w:t>ThreeFish</w:t>
-        </w:r>
-        <w:proofErr w:type="spellEnd"/>
-      </w:hyperlink>
+      <w:r>
+        <w:fldChar w:fldCharType="begin"/>
+      </w:r>
+      <w:r>
+        <w:rPr>
+          <w:lang w:val="en-US"/>
+        </w:rPr>
+        <w:instrText>HYPERLINK "https://www.schneier.com/academic/skein/threefish/"</w:instrText>
+      </w:r>
+      <w:r>
+        <w:fldChar w:fldCharType="separate"/>
+      </w:r>
+      <w:proofErr w:type="spellStart"/>
+      <w:r>
+        <w:rPr>
+          <w:rStyle w:val="Hyperlink"/>
+          <w:lang w:val="en-US"/>
+        </w:rPr>
+        <w:t>ThreeFish</w:t>
+      </w:r>
+      <w:proofErr w:type="spellEnd"/>
+      <w:r>
+        <w:fldChar w:fldCharType="end"/>
+      </w:r>
       <w:r>
         <w:rPr>
           <w:lang w:val="en-US"/>
@@ -6886,17 +7071,30 @@
         </w:rPr>
         <w:t xml:space="preserve"> on </w:t>
       </w:r>
-      <w:hyperlink r:id="rId61" w:history="1">
-        <w:proofErr w:type="spellStart"/>
-        <w:r>
-          <w:rPr>
-            <w:rStyle w:val="Hyperlink"/>
-            <w:lang w:val="en-US"/>
-          </w:rPr>
-          <w:t>TwoFish</w:t>
-        </w:r>
-        <w:proofErr w:type="spellEnd"/>
-      </w:hyperlink>
+      <w:r>
+        <w:fldChar w:fldCharType="begin"/>
+      </w:r>
+      <w:r>
+        <w:rPr>
+          <w:lang w:val="en-US"/>
+        </w:rPr>
+        <w:instrText>HYPERLINK "https://www.schneier.com/academic/twofish/"</w:instrText>
+      </w:r>
+      <w:r>
+        <w:fldChar w:fldCharType="separate"/>
+      </w:r>
+      <w:proofErr w:type="spellStart"/>
+      <w:r>
+        <w:rPr>
+          <w:rStyle w:val="Hyperlink"/>
+          <w:lang w:val="en-US"/>
+        </w:rPr>
+        <w:t>TwoFish</w:t>
+      </w:r>
+      <w:proofErr w:type="spellEnd"/>
+      <w:r>
+        <w:fldChar w:fldCharType="end"/>
+      </w:r>
       <w:r>
         <w:rPr>
           <w:lang w:val="en-US"/>
@@ -7009,7 +7207,7 @@
                     <pic:cNvPicPr/>
                   </pic:nvPicPr>
                   <pic:blipFill>
-                    <a:blip r:embed="rId62"/>
+                    <a:blip r:embed="rId48"/>
                     <a:stretch>
                       <a:fillRect/>
                     </a:stretch>
@@ -7178,7 +7376,12 @@
       </w:r>
     </w:p>
     <w:sectPr>
-      <w:headerReference w:type="default" r:id="rId63"/>
+      <w:headerReference w:type="even" r:id="rId49"/>
+      <w:headerReference w:type="default" r:id="rId50"/>
+      <w:footerReference w:type="even" r:id="rId51"/>
+      <w:footerReference w:type="default" r:id="rId52"/>
+      <w:headerReference w:type="first" r:id="rId53"/>
+      <w:footerReference w:type="first" r:id="rId54"/>
       <w:pgSz w:w="11906" w:h="16838"/>
       <w:pgMar w:top="1440" w:right="1440" w:bottom="1440" w:left="1440" w:header="708" w:footer="708" w:gutter="0"/>
       <w:pgBorders w:offsetFrom="page">
@@ -7219,6 +7422,36 @@
 </w:endnotes>
 </file>
 
+<file path=word/footer1.xml><?xml version="1.0" encoding="utf-8"?>
+<w:ftr xmlns:wpc="http://schemas.microsoft.com/office/word/2010/wordprocessingCanvas" xmlns:cx="http://schemas.microsoft.com/office/drawing/2014/chartex" xmlns:cx1="http://schemas.microsoft.com/office/drawing/2015/9/8/chartex" xmlns:cx2="http://schemas.microsoft.com/office/drawing/2015/10/21/chartex" xmlns:cx3="http://schemas.microsoft.com/office/drawing/2016/5/9/chartex" xmlns:cx4="http://schemas.microsoft.com/office/drawing/2016/5/10/chartex" xmlns:cx5="http://schemas.microsoft.com/office/drawing/2016/5/11/chartex" xmlns:cx6="http://schemas.microsoft.com/office/drawing/2016/5/12/chartex" xmlns:cx7="http://schemas.microsoft.com/office/drawing/2016/5/13/chartex" xmlns:cx8="http://schemas.microsoft.com/office/drawing/2016/5/14/chartex" xmlns:mc="http://schemas.openxmlformats.org/markup-compatibility/2006" xmlns:aink="http://schemas.microsoft.com/office/drawing/2016/ink" xmlns:am3d="http://schemas.microsoft.com/office/drawing/2017/model3d" xmlns:o="urn:schemas-microsoft-com:office:office" xmlns:oel="http://schemas.microsoft.com/office/2019/extlst" xmlns:r="http://schemas.openxmlformats.org/officeDocument/2006/relationships" xmlns:m="http://schemas.openxmlformats.org/officeDocument/2006/math" xmlns:v="urn:schemas-microsoft-com:vml" xmlns:wp14="http://schemas.microsoft.com/office/word/2010/wordprocessingDrawing" xmlns:wp="http://schemas.openxmlformats.org/drawingml/2006/wordprocessingDrawing" xmlns:w10="urn:schemas-microsoft-com:office:word" xmlns:w="http://schemas.openxmlformats.org/wordprocessingml/2006/main" xmlns:w14="http://schemas.microsoft.com/office/word/2010/wordml" xmlns:w15="http://schemas.microsoft.com/office/word/2012/wordml" xmlns:w16cex="http://schemas.microsoft.com/office/word/2018/wordml/cex" xmlns:w16cid="http://schemas.microsoft.com/office/word/2016/wordml/cid" xmlns:w16="http://schemas.microsoft.com/office/word/2018/wordml" xmlns:w16du="http://schemas.microsoft.com/office/word/2023/wordml/word16du" xmlns:w16sdtdh="http://schemas.microsoft.com/office/word/2020/wordml/sdtdatahash" xmlns:w16sdtfl="http://schemas.microsoft.com/office/word/2024/wordml/sdtformatlock" xmlns:w16se="http://schemas.microsoft.com/office/word/2015/wordml/symex" xmlns:wpg="http://schemas.microsoft.com/office/word/2010/wordprocessingGroup" xmlns:wpi="http://schemas.microsoft.com/office/word/2010/wordprocessingInk" xmlns:wne="http://schemas.microsoft.com/office/word/2006/wordml" xmlns:wps="http://schemas.microsoft.com/office/word/2010/wordprocessingShape" mc:Ignorable="w14 w15 w16se w16cid w16 w16cex w16sdtdh w16sdtfl w16du wp14">
+  <w:p>
+    <w:pPr>
+      <w:pStyle w:val="Fuzeile"/>
+    </w:pPr>
+  </w:p>
+</w:ftr>
+</file>
+
+<file path=word/footer2.xml><?xml version="1.0" encoding="utf-8"?>
+<w:ftr xmlns:wpc="http://schemas.microsoft.com/office/word/2010/wordprocessingCanvas" xmlns:cx="http://schemas.microsoft.com/office/drawing/2014/chartex" xmlns:cx1="http://schemas.microsoft.com/office/drawing/2015/9/8/chartex" xmlns:cx2="http://schemas.microsoft.com/office/drawing/2015/10/21/chartex" xmlns:cx3="http://schemas.microsoft.com/office/drawing/2016/5/9/chartex" xmlns:cx4="http://schemas.microsoft.com/office/drawing/2016/5/10/chartex" xmlns:cx5="http://schemas.microsoft.com/office/drawing/2016/5/11/chartex" xmlns:cx6="http://schemas.microsoft.com/office/drawing/2016/5/12/chartex" xmlns:cx7="http://schemas.microsoft.com/office/drawing/2016/5/13/chartex" xmlns:cx8="http://schemas.microsoft.com/office/drawing/2016/5/14/chartex" xmlns:mc="http://schemas.openxmlformats.org/markup-compatibility/2006" xmlns:aink="http://schemas.microsoft.com/office/drawing/2016/ink" xmlns:am3d="http://schemas.microsoft.com/office/drawing/2017/model3d" xmlns:o="urn:schemas-microsoft-com:office:office" xmlns:oel="http://schemas.microsoft.com/office/2019/extlst" xmlns:r="http://schemas.openxmlformats.org/officeDocument/2006/relationships" xmlns:m="http://schemas.openxmlformats.org/officeDocument/2006/math" xmlns:v="urn:schemas-microsoft-com:vml" xmlns:wp14="http://schemas.microsoft.com/office/word/2010/wordprocessingDrawing" xmlns:wp="http://schemas.openxmlformats.org/drawingml/2006/wordprocessingDrawing" xmlns:w10="urn:schemas-microsoft-com:office:word" xmlns:w="http://schemas.openxmlformats.org/wordprocessingml/2006/main" xmlns:w14="http://schemas.microsoft.com/office/word/2010/wordml" xmlns:w15="http://schemas.microsoft.com/office/word/2012/wordml" xmlns:w16cex="http://schemas.microsoft.com/office/word/2018/wordml/cex" xmlns:w16cid="http://schemas.microsoft.com/office/word/2016/wordml/cid" xmlns:w16="http://schemas.microsoft.com/office/word/2018/wordml" xmlns:w16du="http://schemas.microsoft.com/office/word/2023/wordml/word16du" xmlns:w16sdtdh="http://schemas.microsoft.com/office/word/2020/wordml/sdtdatahash" xmlns:w16sdtfl="http://schemas.microsoft.com/office/word/2024/wordml/sdtformatlock" xmlns:w16se="http://schemas.microsoft.com/office/word/2015/wordml/symex" xmlns:wpg="http://schemas.microsoft.com/office/word/2010/wordprocessingGroup" xmlns:wpi="http://schemas.microsoft.com/office/word/2010/wordprocessingInk" xmlns:wne="http://schemas.microsoft.com/office/word/2006/wordml" xmlns:wps="http://schemas.microsoft.com/office/word/2010/wordprocessingShape" mc:Ignorable="w14 w15 w16se w16cid w16 w16cex w16sdtdh w16sdtfl w16du wp14">
+  <w:p>
+    <w:pPr>
+      <w:pStyle w:val="Fuzeile"/>
+    </w:pPr>
+  </w:p>
+</w:ftr>
+</file>
+
+<file path=word/footer3.xml><?xml version="1.0" encoding="utf-8"?>
+<w:ftr xmlns:wpc="http://schemas.microsoft.com/office/word/2010/wordprocessingCanvas" xmlns:cx="http://schemas.microsoft.com/office/drawing/2014/chartex" xmlns:cx1="http://schemas.microsoft.com/office/drawing/2015/9/8/chartex" xmlns:cx2="http://schemas.microsoft.com/office/drawing/2015/10/21/chartex" xmlns:cx3="http://schemas.microsoft.com/office/drawing/2016/5/9/chartex" xmlns:cx4="http://schemas.microsoft.com/office/drawing/2016/5/10/chartex" xmlns:cx5="http://schemas.microsoft.com/office/drawing/2016/5/11/chartex" xmlns:cx6="http://schemas.microsoft.com/office/drawing/2016/5/12/chartex" xmlns:cx7="http://schemas.microsoft.com/office/drawing/2016/5/13/chartex" xmlns:cx8="http://schemas.microsoft.com/office/drawing/2016/5/14/chartex" xmlns:mc="http://schemas.openxmlformats.org/markup-compatibility/2006" xmlns:aink="http://schemas.microsoft.com/office/drawing/2016/ink" xmlns:am3d="http://schemas.microsoft.com/office/drawing/2017/model3d" xmlns:o="urn:schemas-microsoft-com:office:office" xmlns:oel="http://schemas.microsoft.com/office/2019/extlst" xmlns:r="http://schemas.openxmlformats.org/officeDocument/2006/relationships" xmlns:m="http://schemas.openxmlformats.org/officeDocument/2006/math" xmlns:v="urn:schemas-microsoft-com:vml" xmlns:wp14="http://schemas.microsoft.com/office/word/2010/wordprocessingDrawing" xmlns:wp="http://schemas.openxmlformats.org/drawingml/2006/wordprocessingDrawing" xmlns:w10="urn:schemas-microsoft-com:office:word" xmlns:w="http://schemas.openxmlformats.org/wordprocessingml/2006/main" xmlns:w14="http://schemas.microsoft.com/office/word/2010/wordml" xmlns:w15="http://schemas.microsoft.com/office/word/2012/wordml" xmlns:w16cex="http://schemas.microsoft.com/office/word/2018/wordml/cex" xmlns:w16cid="http://schemas.microsoft.com/office/word/2016/wordml/cid" xmlns:w16="http://schemas.microsoft.com/office/word/2018/wordml" xmlns:w16du="http://schemas.microsoft.com/office/word/2023/wordml/word16du" xmlns:w16sdtdh="http://schemas.microsoft.com/office/word/2020/wordml/sdtdatahash" xmlns:w16sdtfl="http://schemas.microsoft.com/office/word/2024/wordml/sdtformatlock" xmlns:w16se="http://schemas.microsoft.com/office/word/2015/wordml/symex" xmlns:wpg="http://schemas.microsoft.com/office/word/2010/wordprocessingGroup" xmlns:wpi="http://schemas.microsoft.com/office/word/2010/wordprocessingInk" xmlns:wne="http://schemas.microsoft.com/office/word/2006/wordml" xmlns:wps="http://schemas.microsoft.com/office/word/2010/wordprocessingShape" mc:Ignorable="w14 w15 w16se w16cid w16 w16cex w16sdtdh w16sdtfl w16du wp14">
+  <w:p>
+    <w:pPr>
+      <w:pStyle w:val="Fuzeile"/>
+    </w:pPr>
+  </w:p>
+</w:ftr>
+</file>
+
 <file path=word/footnotes.xml><?xml version="1.0" encoding="utf-8"?>
 <w:footnotes xmlns:wpc="http://schemas.microsoft.com/office/word/2010/wordprocessingCanvas" xmlns:cx="http://schemas.microsoft.com/office/drawing/2014/chartex" xmlns:cx1="http://schemas.microsoft.com/office/drawing/2015/9/8/chartex" xmlns:cx2="http://schemas.microsoft.com/office/drawing/2015/10/21/chartex" xmlns:cx3="http://schemas.microsoft.com/office/drawing/2016/5/9/chartex" xmlns:cx4="http://schemas.microsoft.com/office/drawing/2016/5/10/chartex" xmlns:cx5="http://schemas.microsoft.com/office/drawing/2016/5/11/chartex" xmlns:cx6="http://schemas.microsoft.com/office/drawing/2016/5/12/chartex" xmlns:cx7="http://schemas.microsoft.com/office/drawing/2016/5/13/chartex" xmlns:cx8="http://schemas.microsoft.com/office/drawing/2016/5/14/chartex" xmlns:mc="http://schemas.openxmlformats.org/markup-compatibility/2006" xmlns:aink="http://schemas.microsoft.com/office/drawing/2016/ink" xmlns:am3d="http://schemas.microsoft.com/office/drawing/2017/model3d" xmlns:o="urn:schemas-microsoft-com:office:office" xmlns:oel="http://schemas.microsoft.com/office/2019/extlst" xmlns:r="http://schemas.openxmlformats.org/officeDocument/2006/relationships" xmlns:m="http://schemas.openxmlformats.org/officeDocument/2006/math" xmlns:v="urn:schemas-microsoft-com:vml" xmlns:wp14="http://schemas.microsoft.com/office/word/2010/wordprocessingDrawing" xmlns:wp="http://schemas.openxmlformats.org/drawingml/2006/wordprocessingDrawing" xmlns:w10="urn:schemas-microsoft-com:office:word" xmlns:w="http://schemas.openxmlformats.org/wordprocessingml/2006/main" xmlns:w14="http://schemas.microsoft.com/office/word/2010/wordml" xmlns:w15="http://schemas.microsoft.com/office/word/2012/wordml" xmlns:w16cex="http://schemas.microsoft.com/office/word/2018/wordml/cex" xmlns:w16cid="http://schemas.microsoft.com/office/word/2016/wordml/cid" xmlns:w16="http://schemas.microsoft.com/office/word/2018/wordml" xmlns:w16du="http://schemas.microsoft.com/office/word/2023/wordml/word16du" xmlns:w16sdtdh="http://schemas.microsoft.com/office/word/2020/wordml/sdtdatahash" xmlns:w16sdtfl="http://schemas.microsoft.com/office/word/2024/wordml/sdtformatlock" xmlns:w16se="http://schemas.microsoft.com/office/word/2015/wordml/symex" xmlns:wpg="http://schemas.microsoft.com/office/word/2010/wordprocessingGroup" xmlns:wpi="http://schemas.microsoft.com/office/word/2010/wordprocessingInk" xmlns:wne="http://schemas.microsoft.com/office/word/2006/wordml" xmlns:wps="http://schemas.microsoft.com/office/word/2010/wordprocessingShape" mc:Ignorable="w14 w15 w16se w16cid w16 w16cex w16sdtdh w16sdtfl w16du wp14">
   <w:footnote w:type="separator" w:id="-1">
@@ -7245,6 +7478,16 @@
 </file>
 
 <file path=word/header1.xml><?xml version="1.0" encoding="utf-8"?>
+<w:hdr xmlns:wpc="http://schemas.microsoft.com/office/word/2010/wordprocessingCanvas" xmlns:cx="http://schemas.microsoft.com/office/drawing/2014/chartex" xmlns:cx1="http://schemas.microsoft.com/office/drawing/2015/9/8/chartex" xmlns:cx2="http://schemas.microsoft.com/office/drawing/2015/10/21/chartex" xmlns:cx3="http://schemas.microsoft.com/office/drawing/2016/5/9/chartex" xmlns:cx4="http://schemas.microsoft.com/office/drawing/2016/5/10/chartex" xmlns:cx5="http://schemas.microsoft.com/office/drawing/2016/5/11/chartex" xmlns:cx6="http://schemas.microsoft.com/office/drawing/2016/5/12/chartex" xmlns:cx7="http://schemas.microsoft.com/office/drawing/2016/5/13/chartex" xmlns:cx8="http://schemas.microsoft.com/office/drawing/2016/5/14/chartex" xmlns:mc="http://schemas.openxmlformats.org/markup-compatibility/2006" xmlns:aink="http://schemas.microsoft.com/office/drawing/2016/ink" xmlns:am3d="http://schemas.microsoft.com/office/drawing/2017/model3d" xmlns:o="urn:schemas-microsoft-com:office:office" xmlns:oel="http://schemas.microsoft.com/office/2019/extlst" xmlns:r="http://schemas.openxmlformats.org/officeDocument/2006/relationships" xmlns:m="http://schemas.openxmlformats.org/officeDocument/2006/math" xmlns:v="urn:schemas-microsoft-com:vml" xmlns:wp14="http://schemas.microsoft.com/office/word/2010/wordprocessingDrawing" xmlns:wp="http://schemas.openxmlformats.org/drawingml/2006/wordprocessingDrawing" xmlns:w10="urn:schemas-microsoft-com:office:word" xmlns:w="http://schemas.openxmlformats.org/wordprocessingml/2006/main" xmlns:w14="http://schemas.microsoft.com/office/word/2010/wordml" xmlns:w15="http://schemas.microsoft.com/office/word/2012/wordml" xmlns:w16cex="http://schemas.microsoft.com/office/word/2018/wordml/cex" xmlns:w16cid="http://schemas.microsoft.com/office/word/2016/wordml/cid" xmlns:w16="http://schemas.microsoft.com/office/word/2018/wordml" xmlns:w16du="http://schemas.microsoft.com/office/word/2023/wordml/word16du" xmlns:w16sdtdh="http://schemas.microsoft.com/office/word/2020/wordml/sdtdatahash" xmlns:w16sdtfl="http://schemas.microsoft.com/office/word/2024/wordml/sdtformatlock" xmlns:w16se="http://schemas.microsoft.com/office/word/2015/wordml/symex" xmlns:wpg="http://schemas.microsoft.com/office/word/2010/wordprocessingGroup" xmlns:wpi="http://schemas.microsoft.com/office/word/2010/wordprocessingInk" xmlns:wne="http://schemas.microsoft.com/office/word/2006/wordml" xmlns:wps="http://schemas.microsoft.com/office/word/2010/wordprocessingShape" mc:Ignorable="w14 w15 w16se w16cid w16 w16cex w16sdtdh w16sdtfl w16du wp14">
+  <w:p>
+    <w:pPr>
+      <w:pStyle w:val="Kopfzeile"/>
+    </w:pPr>
+  </w:p>
+</w:hdr>
+</file>
+
+<file path=word/header2.xml><?xml version="1.0" encoding="utf-8"?>
 <w:hdr xmlns:wpc="http://schemas.microsoft.com/office/word/2010/wordprocessingCanvas" xmlns:cx="http://schemas.microsoft.com/office/drawing/2014/chartex" xmlns:cx1="http://schemas.microsoft.com/office/drawing/2015/9/8/chartex" xmlns:cx2="http://schemas.microsoft.com/office/drawing/2015/10/21/chartex" xmlns:cx3="http://schemas.microsoft.com/office/drawing/2016/5/9/chartex" xmlns:cx4="http://schemas.microsoft.com/office/drawing/2016/5/10/chartex" xmlns:cx5="http://schemas.microsoft.com/office/drawing/2016/5/11/chartex" xmlns:cx6="http://schemas.microsoft.com/office/drawing/2016/5/12/chartex" xmlns:cx7="http://schemas.microsoft.com/office/drawing/2016/5/13/chartex" xmlns:cx8="http://schemas.microsoft.com/office/drawing/2016/5/14/chartex" xmlns:mc="http://schemas.openxmlformats.org/markup-compatibility/2006" xmlns:aink="http://schemas.microsoft.com/office/drawing/2016/ink" xmlns:am3d="http://schemas.microsoft.com/office/drawing/2017/model3d" xmlns:o="urn:schemas-microsoft-com:office:office" xmlns:oel="http://schemas.microsoft.com/office/2019/extlst" xmlns:r="http://schemas.openxmlformats.org/officeDocument/2006/relationships" xmlns:m="http://schemas.openxmlformats.org/officeDocument/2006/math" xmlns:v="urn:schemas-microsoft-com:vml" xmlns:wp14="http://schemas.microsoft.com/office/word/2010/wordprocessingDrawing" xmlns:wp="http://schemas.openxmlformats.org/drawingml/2006/wordprocessingDrawing" xmlns:w10="urn:schemas-microsoft-com:office:word" xmlns:w="http://schemas.openxmlformats.org/wordprocessingml/2006/main" xmlns:w14="http://schemas.microsoft.com/office/word/2010/wordml" xmlns:w15="http://schemas.microsoft.com/office/word/2012/wordml" xmlns:w16cex="http://schemas.microsoft.com/office/word/2018/wordml/cex" xmlns:w16cid="http://schemas.microsoft.com/office/word/2016/wordml/cid" xmlns:w16="http://schemas.microsoft.com/office/word/2018/wordml" xmlns:w16du="http://schemas.microsoft.com/office/word/2023/wordml/word16du" xmlns:w16sdtdh="http://schemas.microsoft.com/office/word/2020/wordml/sdtdatahash" xmlns:w16sdtfl="http://schemas.microsoft.com/office/word/2024/wordml/sdtformatlock" xmlns:w16se="http://schemas.microsoft.com/office/word/2015/wordml/symex" xmlns:wpg="http://schemas.microsoft.com/office/word/2010/wordprocessingGroup" xmlns:wpi="http://schemas.microsoft.com/office/word/2010/wordprocessingInk" xmlns:wne="http://schemas.microsoft.com/office/word/2006/wordml" xmlns:wps="http://schemas.microsoft.com/office/word/2010/wordprocessingShape" mc:Ignorable="w14 w15 w16se w16cid w16 w16cex w16sdtdh w16sdtfl w16du wp14">
   <w:tbl>
     <w:tblPr>
@@ -7785,6 +8028,16 @@
       </w:rPr>
       <w:t>5</w:t>
     </w:r>
+  </w:p>
+</w:hdr>
+</file>
+
+<file path=word/header3.xml><?xml version="1.0" encoding="utf-8"?>
+<w:hdr xmlns:wpc="http://schemas.microsoft.com/office/word/2010/wordprocessingCanvas" xmlns:cx="http://schemas.microsoft.com/office/drawing/2014/chartex" xmlns:cx1="http://schemas.microsoft.com/office/drawing/2015/9/8/chartex" xmlns:cx2="http://schemas.microsoft.com/office/drawing/2015/10/21/chartex" xmlns:cx3="http://schemas.microsoft.com/office/drawing/2016/5/9/chartex" xmlns:cx4="http://schemas.microsoft.com/office/drawing/2016/5/10/chartex" xmlns:cx5="http://schemas.microsoft.com/office/drawing/2016/5/11/chartex" xmlns:cx6="http://schemas.microsoft.com/office/drawing/2016/5/12/chartex" xmlns:cx7="http://schemas.microsoft.com/office/drawing/2016/5/13/chartex" xmlns:cx8="http://schemas.microsoft.com/office/drawing/2016/5/14/chartex" xmlns:mc="http://schemas.openxmlformats.org/markup-compatibility/2006" xmlns:aink="http://schemas.microsoft.com/office/drawing/2016/ink" xmlns:am3d="http://schemas.microsoft.com/office/drawing/2017/model3d" xmlns:o="urn:schemas-microsoft-com:office:office" xmlns:oel="http://schemas.microsoft.com/office/2019/extlst" xmlns:r="http://schemas.openxmlformats.org/officeDocument/2006/relationships" xmlns:m="http://schemas.openxmlformats.org/officeDocument/2006/math" xmlns:v="urn:schemas-microsoft-com:vml" xmlns:wp14="http://schemas.microsoft.com/office/word/2010/wordprocessingDrawing" xmlns:wp="http://schemas.openxmlformats.org/drawingml/2006/wordprocessingDrawing" xmlns:w10="urn:schemas-microsoft-com:office:word" xmlns:w="http://schemas.openxmlformats.org/wordprocessingml/2006/main" xmlns:w14="http://schemas.microsoft.com/office/word/2010/wordml" xmlns:w15="http://schemas.microsoft.com/office/word/2012/wordml" xmlns:w16cex="http://schemas.microsoft.com/office/word/2018/wordml/cex" xmlns:w16cid="http://schemas.microsoft.com/office/word/2016/wordml/cid" xmlns:w16="http://schemas.microsoft.com/office/word/2018/wordml" xmlns:w16du="http://schemas.microsoft.com/office/word/2023/wordml/word16du" xmlns:w16sdtdh="http://schemas.microsoft.com/office/word/2020/wordml/sdtdatahash" xmlns:w16sdtfl="http://schemas.microsoft.com/office/word/2024/wordml/sdtformatlock" xmlns:w16se="http://schemas.microsoft.com/office/word/2015/wordml/symex" xmlns:wpg="http://schemas.microsoft.com/office/word/2010/wordprocessingGroup" xmlns:wpi="http://schemas.microsoft.com/office/word/2010/wordprocessingInk" xmlns:wne="http://schemas.microsoft.com/office/word/2006/wordml" xmlns:wps="http://schemas.microsoft.com/office/word/2010/wordprocessingShape" mc:Ignorable="w14 w15 w16se w16cid w16 w16cex w16sdtdh w16sdtfl w16du wp14">
+  <w:p>
+    <w:pPr>
+      <w:pStyle w:val="Kopfzeile"/>
+    </w:pPr>
   </w:p>
 </w:hdr>
 </file>
@@ -8632,6 +8885,7 @@
   <w:style w:type="character" w:default="1" w:styleId="Absatz-Standardschriftart">
     <w:name w:val="Default Paragraph Font"/>
     <w:uiPriority w:val="1"/>
+    <w:semiHidden/>
     <w:unhideWhenUsed/>
   </w:style>
   <w:style w:type="table" w:default="1" w:styleId="NormaleTabelle">

</xml_diff>